<commit_message>
Updating Preliminary Results report to include feature engineering and data preparation section. Also, adding completed Module 7 course work.
</commit_message>
<xml_diff>
--- a/Course_Project/Preliminary_Results/Preliminary_Results_RCW.docx
+++ b/Course_Project/Preliminary_Results/Preliminary_Results_RCW.docx
@@ -191,14 +191,14 @@
             </w:rPr>
             <w:fldChar w:fldCharType="separate"/>
           </w:r>
-          <w:hyperlink w:anchor="_Toc205742929" w:history="1">
+          <w:hyperlink w:anchor="_Toc206849143" w:history="1">
             <w:r>
               <w:rPr>
                 <w:rStyle w:val="Hyperlink"/>
                 <w:rFonts w:ascii="Times New Roman" w:hAnsi="Times New Roman"/>
                 <w:noProof/>
               </w:rPr>
-              <w:t>Model Implementation and Results</w:t>
+              <w:t>Data Preparation and Feature Engineering</w:t>
             </w:r>
             <w:r>
               <w:rPr>
@@ -219,7 +219,7 @@
                 <w:noProof/>
                 <w:webHidden/>
               </w:rPr>
-              <w:instrText xml:space="preserve"> PAGEREF _Toc205742929 \h </w:instrText>
+              <w:instrText xml:space="preserve"> PAGEREF _Toc206849143 \h </w:instrText>
             </w:r>
             <w:r>
               <w:rPr>
@@ -265,14 +265,14 @@
               <w14:ligatures w14:val="standardContextual"/>
             </w:rPr>
           </w:pPr>
-          <w:hyperlink w:anchor="_Toc205742930" w:history="1">
+          <w:hyperlink w:anchor="_Toc206849144" w:history="1">
             <w:r>
               <w:rPr>
                 <w:rStyle w:val="Hyperlink"/>
                 <w:rFonts w:ascii="Times New Roman" w:hAnsi="Times New Roman"/>
                 <w:noProof/>
               </w:rPr>
-              <w:t>Robust Variable Selection Process</w:t>
+              <w:t>Model Implementation and Results</w:t>
             </w:r>
             <w:r>
               <w:rPr>
@@ -293,7 +293,7 @@
                 <w:noProof/>
                 <w:webHidden/>
               </w:rPr>
-              <w:instrText xml:space="preserve"> PAGEREF _Toc205742930 \h </w:instrText>
+              <w:instrText xml:space="preserve"> PAGEREF _Toc206849144 \h </w:instrText>
             </w:r>
             <w:r>
               <w:rPr>
@@ -313,7 +313,7 @@
                 <w:noProof/>
                 <w:webHidden/>
               </w:rPr>
-              <w:t>7</w:t>
+              <w:t>6</w:t>
             </w:r>
             <w:r>
               <w:rPr>
@@ -339,14 +339,14 @@
               <w14:ligatures w14:val="standardContextual"/>
             </w:rPr>
           </w:pPr>
-          <w:hyperlink w:anchor="_Toc205742931" w:history="1">
+          <w:hyperlink w:anchor="_Toc206849145" w:history="1">
             <w:r>
               <w:rPr>
                 <w:rStyle w:val="Hyperlink"/>
                 <w:rFonts w:ascii="Times New Roman" w:hAnsi="Times New Roman"/>
                 <w:noProof/>
               </w:rPr>
-              <w:t>Model Comparison</w:t>
+              <w:t>Robust Variable Selection Process</w:t>
             </w:r>
             <w:r>
               <w:rPr>
@@ -367,7 +367,7 @@
                 <w:noProof/>
                 <w:webHidden/>
               </w:rPr>
-              <w:instrText xml:space="preserve"> PAGEREF _Toc205742931 \h </w:instrText>
+              <w:instrText xml:space="preserve"> PAGEREF _Toc206849145 \h </w:instrText>
             </w:r>
             <w:r>
               <w:rPr>
@@ -387,7 +387,7 @@
                 <w:noProof/>
                 <w:webHidden/>
               </w:rPr>
-              <w:t>8</w:t>
+              <w:t>10</w:t>
             </w:r>
             <w:r>
               <w:rPr>
@@ -413,14 +413,14 @@
               <w14:ligatures w14:val="standardContextual"/>
             </w:rPr>
           </w:pPr>
-          <w:hyperlink w:anchor="_Toc205742932" w:history="1">
+          <w:hyperlink w:anchor="_Toc206849146" w:history="1">
             <w:r>
               <w:rPr>
                 <w:rStyle w:val="Hyperlink"/>
                 <w:rFonts w:ascii="Times New Roman" w:hAnsi="Times New Roman"/>
                 <w:noProof/>
               </w:rPr>
-              <w:t>Recommendations for Phase 3</w:t>
+              <w:t>Model Comparison</w:t>
             </w:r>
             <w:r>
               <w:rPr>
@@ -441,7 +441,7 @@
                 <w:noProof/>
                 <w:webHidden/>
               </w:rPr>
-              <w:instrText xml:space="preserve"> PAGEREF _Toc205742932 \h </w:instrText>
+              <w:instrText xml:space="preserve"> PAGEREF _Toc206849146 \h </w:instrText>
             </w:r>
             <w:r>
               <w:rPr>
@@ -462,6 +462,80 @@
                 <w:webHidden/>
               </w:rPr>
               <w:t>11</w:t>
+            </w:r>
+            <w:r>
+              <w:rPr>
+                <w:noProof/>
+                <w:webHidden/>
+              </w:rPr>
+              <w:fldChar w:fldCharType="end"/>
+            </w:r>
+          </w:hyperlink>
+        </w:p>
+        <w:p>
+          <w:pPr>
+            <w:pStyle w:val="TOC1"/>
+            <w:tabs>
+              <w:tab w:val="right" w:leader="dot" w:pos="10790"/>
+            </w:tabs>
+            <w:rPr>
+              <w:rFonts w:cstheme="minorBidi"/>
+              <w:noProof/>
+              <w:kern w:val="2"/>
+              <w:sz w:val="24"/>
+              <w:szCs w:val="24"/>
+              <w14:ligatures w14:val="standardContextual"/>
+            </w:rPr>
+          </w:pPr>
+          <w:hyperlink w:anchor="_Toc206849147" w:history="1">
+            <w:r>
+              <w:rPr>
+                <w:rStyle w:val="Hyperlink"/>
+                <w:rFonts w:ascii="Times New Roman" w:hAnsi="Times New Roman"/>
+                <w:noProof/>
+              </w:rPr>
+              <w:t>Recommendations for Phase 3</w:t>
+            </w:r>
+            <w:r>
+              <w:rPr>
+                <w:noProof/>
+                <w:webHidden/>
+              </w:rPr>
+              <w:tab/>
+            </w:r>
+            <w:r>
+              <w:rPr>
+                <w:noProof/>
+                <w:webHidden/>
+              </w:rPr>
+              <w:fldChar w:fldCharType="begin"/>
+            </w:r>
+            <w:r>
+              <w:rPr>
+                <w:noProof/>
+                <w:webHidden/>
+              </w:rPr>
+              <w:instrText xml:space="preserve"> PAGEREF _Toc206849147 \h </w:instrText>
+            </w:r>
+            <w:r>
+              <w:rPr>
+                <w:noProof/>
+                <w:webHidden/>
+              </w:rPr>
+            </w:r>
+            <w:r>
+              <w:rPr>
+                <w:noProof/>
+                <w:webHidden/>
+              </w:rPr>
+              <w:fldChar w:fldCharType="separate"/>
+            </w:r>
+            <w:r>
+              <w:rPr>
+                <w:noProof/>
+                <w:webHidden/>
+              </w:rPr>
+              <w:t>14</w:t>
             </w:r>
             <w:r>
               <w:rPr>
@@ -516,13 +590,13 @@
           <w:rFonts w:ascii="Times New Roman" w:hAnsi="Times New Roman" w:cs="Times New Roman"/>
         </w:rPr>
       </w:pPr>
-      <w:bookmarkStart w:id="0" w:name="_Toc205742929"/>
+      <w:bookmarkStart w:id="0" w:name="_Toc206849143"/>
       <w:r>
         <w:rPr>
           <w:rFonts w:ascii="Times New Roman" w:hAnsi="Times New Roman" w:cs="Times New Roman"/>
         </w:rPr>
         <w:lastRenderedPageBreak/>
-        <w:t>Model Implementation and Results</w:t>
+        <w:t>Data Preparation and Feature Engineering</w:t>
       </w:r>
       <w:bookmarkEnd w:id="0"/>
     </w:p>
@@ -533,6 +607,1292 @@
         </w:rPr>
       </w:pPr>
       <w:r>
+        <w:tab/>
+      </w:r>
+      <w:r>
+        <w:rPr>
+          <w:rFonts w:ascii="Times New Roman" w:hAnsi="Times New Roman" w:cs="Times New Roman"/>
+        </w:rPr>
+        <w:t xml:space="preserve">The data preparation and feature engineering </w:t>
+      </w:r>
+      <w:r>
+        <w:rPr>
+          <w:rFonts w:ascii="Times New Roman" w:hAnsi="Times New Roman" w:cs="Times New Roman"/>
+        </w:rPr>
+        <w:t>process conducted during the init</w:t>
+      </w:r>
+      <w:r>
+        <w:rPr>
+          <w:rFonts w:ascii="Times New Roman" w:hAnsi="Times New Roman" w:cs="Times New Roman"/>
+        </w:rPr>
+        <w:t xml:space="preserve">ial </w:t>
+      </w:r>
+      <w:r>
+        <w:rPr>
+          <w:rFonts w:ascii="Times New Roman" w:hAnsi="Times New Roman" w:cs="Times New Roman"/>
+        </w:rPr>
+        <w:t>experimentation can be bro</w:t>
+      </w:r>
+      <w:r>
+        <w:rPr>
+          <w:rFonts w:ascii="Times New Roman" w:hAnsi="Times New Roman" w:cs="Times New Roman"/>
+        </w:rPr>
+        <w:t xml:space="preserve">ken into three subsections: data cleaning and preparation, </w:t>
+      </w:r>
+      <w:r>
+        <w:rPr>
+          <w:rFonts w:ascii="Times New Roman" w:hAnsi="Times New Roman" w:cs="Times New Roman"/>
+        </w:rPr>
+        <w:t xml:space="preserve">feature engineering, and train-test </w:t>
+      </w:r>
+      <w:r>
+        <w:rPr>
+          <w:rFonts w:ascii="Times New Roman" w:hAnsi="Times New Roman" w:cs="Times New Roman"/>
+        </w:rPr>
+        <w:t>data split. Each of these subsections are explained, in detail, below.</w:t>
+      </w:r>
+    </w:p>
+    <w:p>
+      <w:pPr>
+        <w:rPr>
+          <w:rFonts w:ascii="Times New Roman" w:hAnsi="Times New Roman" w:cs="Times New Roman"/>
+        </w:rPr>
+      </w:pPr>
+      <w:r>
+        <w:rPr>
+          <w:rFonts w:ascii="Times New Roman" w:hAnsi="Times New Roman" w:cs="Times New Roman"/>
+        </w:rPr>
+        <w:tab/>
+        <w:t xml:space="preserve">Data cleaning and preparation </w:t>
+      </w:r>
+      <w:proofErr w:type="gramStart"/>
+      <w:r>
+        <w:rPr>
+          <w:rFonts w:ascii="Times New Roman" w:hAnsi="Times New Roman" w:cs="Times New Roman"/>
+        </w:rPr>
+        <w:t>was</w:t>
+      </w:r>
+      <w:proofErr w:type="gramEnd"/>
+      <w:r>
+        <w:rPr>
+          <w:rFonts w:ascii="Times New Roman" w:hAnsi="Times New Roman" w:cs="Times New Roman"/>
+        </w:rPr>
+        <w:t xml:space="preserve"> </w:t>
+      </w:r>
+      <w:r>
+        <w:rPr>
+          <w:rFonts w:ascii="Times New Roman" w:hAnsi="Times New Roman" w:cs="Times New Roman"/>
+        </w:rPr>
+        <w:t xml:space="preserve">performed experimentally throughout the </w:t>
+      </w:r>
+      <w:proofErr w:type="gramStart"/>
+      <w:r>
+        <w:rPr>
+          <w:rFonts w:ascii="Times New Roman" w:hAnsi="Times New Roman" w:cs="Times New Roman"/>
+        </w:rPr>
+        <w:t>exploratory</w:t>
+      </w:r>
+      <w:proofErr w:type="gramEnd"/>
+      <w:r>
+        <w:rPr>
+          <w:rFonts w:ascii="Times New Roman" w:hAnsi="Times New Roman" w:cs="Times New Roman"/>
+        </w:rPr>
+        <w:t xml:space="preserve"> model building process. Initially, all models (KNN, QDA,</w:t>
+      </w:r>
+      <w:r>
+        <w:rPr>
+          <w:rFonts w:ascii="Times New Roman" w:hAnsi="Times New Roman" w:cs="Times New Roman"/>
+        </w:rPr>
+        <w:t xml:space="preserve"> and Logistic Regression) were </w:t>
+      </w:r>
+      <w:r>
+        <w:rPr>
+          <w:rFonts w:ascii="Times New Roman" w:hAnsi="Times New Roman" w:cs="Times New Roman"/>
+        </w:rPr>
+        <w:t>n</w:t>
+      </w:r>
+      <w:r>
+        <w:rPr>
+          <w:rFonts w:ascii="Times New Roman" w:hAnsi="Times New Roman" w:cs="Times New Roman"/>
+        </w:rPr>
+        <w:t>aïve</w:t>
+      </w:r>
+      <w:r>
+        <w:rPr>
+          <w:rFonts w:ascii="Times New Roman" w:hAnsi="Times New Roman" w:cs="Times New Roman"/>
+        </w:rPr>
+        <w:t xml:space="preserve">ly trained on the entire data set </w:t>
+      </w:r>
+      <w:r>
+        <w:rPr>
+          <w:rFonts w:ascii="Times New Roman" w:hAnsi="Times New Roman" w:cs="Times New Roman"/>
+        </w:rPr>
+        <w:t>to</w:t>
+      </w:r>
+      <w:r>
+        <w:rPr>
+          <w:rFonts w:ascii="Times New Roman" w:hAnsi="Times New Roman" w:cs="Times New Roman"/>
+        </w:rPr>
+        <w:t xml:space="preserve"> understand</w:t>
+      </w:r>
+      <w:r>
+        <w:rPr>
+          <w:rFonts w:ascii="Times New Roman" w:hAnsi="Times New Roman" w:cs="Times New Roman"/>
+        </w:rPr>
+        <w:t xml:space="preserve"> the model performance with the unmodified data set. During this training process, class imbalance was identified as a key </w:t>
+      </w:r>
+      <w:r>
+        <w:rPr>
+          <w:rFonts w:ascii="Times New Roman" w:hAnsi="Times New Roman" w:cs="Times New Roman"/>
+        </w:rPr>
+        <w:t xml:space="preserve">issue for model performance. This was corrected experimentally for each model </w:t>
+      </w:r>
+      <w:r>
+        <w:rPr>
+          <w:rFonts w:ascii="Times New Roman" w:hAnsi="Times New Roman" w:cs="Times New Roman"/>
+        </w:rPr>
+        <w:t>with a cleaning process that randomly removed</w:t>
+      </w:r>
+      <w:r>
+        <w:rPr>
+          <w:rFonts w:ascii="Times New Roman" w:hAnsi="Times New Roman" w:cs="Times New Roman"/>
+        </w:rPr>
+        <w:t xml:space="preserve"> (random seed = 42)</w:t>
+      </w:r>
+      <w:r>
+        <w:rPr>
+          <w:rFonts w:ascii="Times New Roman" w:hAnsi="Times New Roman" w:cs="Times New Roman"/>
+        </w:rPr>
+        <w:t xml:space="preserve"> a given percentage of the </w:t>
+      </w:r>
+      <w:r>
+        <w:rPr>
+          <w:rFonts w:ascii="Times New Roman" w:hAnsi="Times New Roman" w:cs="Times New Roman"/>
+        </w:rPr>
+        <w:t xml:space="preserve">observations where </w:t>
+      </w:r>
+      <w:proofErr w:type="spellStart"/>
+      <w:r>
+        <w:rPr>
+          <w:rFonts w:ascii="Times New Roman" w:hAnsi="Times New Roman" w:cs="Times New Roman"/>
+        </w:rPr>
+        <w:t>Attrition_Flag</w:t>
+      </w:r>
+      <w:proofErr w:type="spellEnd"/>
+      <w:r>
+        <w:rPr>
+          <w:rFonts w:ascii="Times New Roman" w:hAnsi="Times New Roman" w:cs="Times New Roman"/>
+        </w:rPr>
+        <w:t xml:space="preserve"> equaled 0. </w:t>
+      </w:r>
+      <w:r>
+        <w:rPr>
+          <w:rFonts w:ascii="Times New Roman" w:hAnsi="Times New Roman" w:cs="Times New Roman"/>
+        </w:rPr>
+        <w:t xml:space="preserve">Each model was trained with configurations of </w:t>
+      </w:r>
+      <w:r>
+        <w:rPr>
+          <w:rFonts w:ascii="Times New Roman" w:hAnsi="Times New Roman" w:cs="Times New Roman"/>
+        </w:rPr>
+        <w:t xml:space="preserve">no reduction in </w:t>
+      </w:r>
+      <w:proofErr w:type="spellStart"/>
+      <w:r>
+        <w:rPr>
+          <w:rFonts w:ascii="Times New Roman" w:hAnsi="Times New Roman" w:cs="Times New Roman"/>
+        </w:rPr>
+        <w:t>Attrition_Flag</w:t>
+      </w:r>
+      <w:proofErr w:type="spellEnd"/>
+      <w:r>
+        <w:rPr>
+          <w:rFonts w:ascii="Times New Roman" w:hAnsi="Times New Roman" w:cs="Times New Roman"/>
+        </w:rPr>
+        <w:t xml:space="preserve"> = 0 observations, </w:t>
+      </w:r>
+      <w:r>
+        <w:rPr>
+          <w:rFonts w:ascii="Times New Roman" w:hAnsi="Times New Roman" w:cs="Times New Roman"/>
+        </w:rPr>
+        <w:t xml:space="preserve">65% reduction of </w:t>
+      </w:r>
+      <w:proofErr w:type="spellStart"/>
+      <w:r>
+        <w:rPr>
+          <w:rFonts w:ascii="Times New Roman" w:hAnsi="Times New Roman" w:cs="Times New Roman"/>
+        </w:rPr>
+        <w:t>Attrition_Flag</w:t>
+      </w:r>
+      <w:proofErr w:type="spellEnd"/>
+      <w:r>
+        <w:rPr>
+          <w:rFonts w:ascii="Times New Roman" w:hAnsi="Times New Roman" w:cs="Times New Roman"/>
+        </w:rPr>
+        <w:t xml:space="preserve"> = 0 observations</w:t>
+      </w:r>
+      <w:r>
+        <w:rPr>
+          <w:rFonts w:ascii="Times New Roman" w:hAnsi="Times New Roman" w:cs="Times New Roman"/>
+        </w:rPr>
+        <w:t xml:space="preserve">, and 75% reduction of </w:t>
+      </w:r>
+      <w:proofErr w:type="spellStart"/>
+      <w:r>
+        <w:rPr>
+          <w:rFonts w:ascii="Times New Roman" w:hAnsi="Times New Roman" w:cs="Times New Roman"/>
+        </w:rPr>
+        <w:t>Attrition_Flag</w:t>
+      </w:r>
+      <w:proofErr w:type="spellEnd"/>
+      <w:r>
+        <w:rPr>
+          <w:rFonts w:ascii="Times New Roman" w:hAnsi="Times New Roman" w:cs="Times New Roman"/>
+        </w:rPr>
+        <w:t xml:space="preserve"> = 0 observations</w:t>
+      </w:r>
+      <w:r>
+        <w:rPr>
+          <w:rFonts w:ascii="Times New Roman" w:hAnsi="Times New Roman" w:cs="Times New Roman"/>
+        </w:rPr>
+        <w:t xml:space="preserve">. Additionally, </w:t>
+      </w:r>
+      <w:r>
+        <w:rPr>
+          <w:rFonts w:ascii="Times New Roman" w:hAnsi="Times New Roman" w:cs="Times New Roman"/>
+        </w:rPr>
+        <w:t xml:space="preserve">stepwise variable selection was utilized </w:t>
+      </w:r>
+      <w:r>
+        <w:rPr>
+          <w:rFonts w:ascii="Times New Roman" w:hAnsi="Times New Roman" w:cs="Times New Roman"/>
+        </w:rPr>
+        <w:t>to remove non-influential variables from the data set</w:t>
+      </w:r>
+      <w:r>
+        <w:rPr>
+          <w:rFonts w:ascii="Times New Roman" w:hAnsi="Times New Roman" w:cs="Times New Roman"/>
+        </w:rPr>
+        <w:t>, as seen in the Robust Variable Selection section</w:t>
+      </w:r>
+      <w:r>
+        <w:rPr>
+          <w:rFonts w:ascii="Times New Roman" w:hAnsi="Times New Roman" w:cs="Times New Roman"/>
+        </w:rPr>
+        <w:t xml:space="preserve">. This, in tandem with the </w:t>
+      </w:r>
+      <w:r>
+        <w:rPr>
+          <w:rFonts w:ascii="Times New Roman" w:hAnsi="Times New Roman" w:cs="Times New Roman"/>
+        </w:rPr>
+        <w:t>class imbala</w:t>
+      </w:r>
+      <w:r>
+        <w:rPr>
+          <w:rFonts w:ascii="Times New Roman" w:hAnsi="Times New Roman" w:cs="Times New Roman"/>
+        </w:rPr>
+        <w:t>nce correction</w:t>
+      </w:r>
+      <w:r>
+        <w:rPr>
+          <w:rFonts w:ascii="Times New Roman" w:hAnsi="Times New Roman" w:cs="Times New Roman"/>
+        </w:rPr>
+        <w:t xml:space="preserve">, encompasses the methodology for data preparation and cleaning </w:t>
+      </w:r>
+      <w:r>
+        <w:rPr>
+          <w:rFonts w:ascii="Times New Roman" w:hAnsi="Times New Roman" w:cs="Times New Roman"/>
+        </w:rPr>
+        <w:t>used during this phase of model development.</w:t>
+      </w:r>
+    </w:p>
+    <w:p>
+      <w:pPr>
+        <w:rPr>
+          <w:rFonts w:ascii="Times New Roman" w:hAnsi="Times New Roman" w:cs="Times New Roman"/>
+        </w:rPr>
+      </w:pPr>
+      <w:r>
+        <w:rPr>
+          <w:rFonts w:ascii="Times New Roman" w:hAnsi="Times New Roman" w:cs="Times New Roman"/>
+        </w:rPr>
+        <w:tab/>
+      </w:r>
+      <w:r>
+        <w:rPr>
+          <w:rFonts w:ascii="Times New Roman" w:hAnsi="Times New Roman" w:cs="Times New Roman"/>
+        </w:rPr>
+        <w:t xml:space="preserve">Feature engineering represented a significant </w:t>
+      </w:r>
+      <w:r>
+        <w:rPr>
+          <w:rFonts w:ascii="Times New Roman" w:hAnsi="Times New Roman" w:cs="Times New Roman"/>
+        </w:rPr>
+        <w:t xml:space="preserve">effort in this analysis. Harkening back to the Analytic Plan phase of this project, </w:t>
+      </w:r>
+      <w:r>
+        <w:rPr>
+          <w:rFonts w:ascii="Times New Roman" w:hAnsi="Times New Roman" w:cs="Times New Roman"/>
+        </w:rPr>
+        <w:t xml:space="preserve">there were four new variables identified for </w:t>
+      </w:r>
+      <w:r>
+        <w:rPr>
+          <w:rFonts w:ascii="Times New Roman" w:hAnsi="Times New Roman" w:cs="Times New Roman"/>
+        </w:rPr>
+        <w:t xml:space="preserve">feature engineering: </w:t>
+      </w:r>
+      <w:proofErr w:type="spellStart"/>
+      <w:r>
+        <w:rPr>
+          <w:rFonts w:ascii="Times New Roman" w:hAnsi="Times New Roman" w:cs="Times New Roman"/>
+        </w:rPr>
+        <w:t>Balance_To_TC</w:t>
+      </w:r>
+      <w:proofErr w:type="spellEnd"/>
+      <w:r>
+        <w:rPr>
+          <w:rFonts w:ascii="Times New Roman" w:hAnsi="Times New Roman" w:cs="Times New Roman"/>
+        </w:rPr>
+        <w:t xml:space="preserve">, </w:t>
+      </w:r>
+      <w:r>
+        <w:rPr>
+          <w:rFonts w:ascii="Times New Roman" w:hAnsi="Times New Roman" w:cs="Times New Roman"/>
+        </w:rPr>
+        <w:br/>
+      </w:r>
+      <w:proofErr w:type="spellStart"/>
+      <w:r>
+        <w:rPr>
+          <w:rFonts w:ascii="Times New Roman" w:hAnsi="Times New Roman" w:cs="Times New Roman"/>
+        </w:rPr>
+        <w:t>Credit_Limit_per_Income</w:t>
+      </w:r>
+      <w:proofErr w:type="spellEnd"/>
+      <w:r>
+        <w:rPr>
+          <w:rFonts w:ascii="Times New Roman" w:hAnsi="Times New Roman" w:cs="Times New Roman"/>
+        </w:rPr>
+        <w:t xml:space="preserve">, </w:t>
+      </w:r>
+      <w:proofErr w:type="spellStart"/>
+      <w:r>
+        <w:rPr>
+          <w:rFonts w:ascii="Times New Roman" w:hAnsi="Times New Roman" w:cs="Times New Roman"/>
+        </w:rPr>
+        <w:t>Leveraged_Balance_Ratio</w:t>
+      </w:r>
+      <w:proofErr w:type="spellEnd"/>
+      <w:r>
+        <w:rPr>
+          <w:rFonts w:ascii="Times New Roman" w:hAnsi="Times New Roman" w:cs="Times New Roman"/>
+        </w:rPr>
+        <w:t xml:space="preserve">, and </w:t>
+      </w:r>
+      <w:proofErr w:type="spellStart"/>
+      <w:r>
+        <w:rPr>
+          <w:rFonts w:ascii="Times New Roman" w:hAnsi="Times New Roman" w:cs="Times New Roman"/>
+        </w:rPr>
+        <w:t>Relationship_Strength</w:t>
+      </w:r>
+      <w:proofErr w:type="spellEnd"/>
+      <w:r>
+        <w:rPr>
+          <w:rFonts w:ascii="Times New Roman" w:hAnsi="Times New Roman" w:cs="Times New Roman"/>
+        </w:rPr>
+        <w:t xml:space="preserve">. A brief description of each variable can be </w:t>
+      </w:r>
+      <w:proofErr w:type="gramStart"/>
+      <w:r>
+        <w:rPr>
+          <w:rFonts w:ascii="Times New Roman" w:hAnsi="Times New Roman" w:cs="Times New Roman"/>
+        </w:rPr>
+        <w:t>found,</w:t>
+      </w:r>
+      <w:proofErr w:type="gramEnd"/>
+      <w:r>
+        <w:rPr>
+          <w:rFonts w:ascii="Times New Roman" w:hAnsi="Times New Roman" w:cs="Times New Roman"/>
+        </w:rPr>
+        <w:t xml:space="preserve"> below: </w:t>
+      </w:r>
+    </w:p>
+    <w:p>
+      <w:pPr>
+        <w:pStyle w:val="ListParagraph"/>
+        <w:numPr>
+          <w:ilvl w:val="0"/>
+          <w:numId w:val="3"/>
+        </w:numPr>
+        <w:rPr>
+          <w:rFonts w:ascii="Times New Roman" w:hAnsi="Times New Roman" w:cs="Times New Roman"/>
+        </w:rPr>
+      </w:pPr>
+      <w:proofErr w:type="spellStart"/>
+      <w:r>
+        <w:rPr>
+          <w:rFonts w:ascii="Times New Roman" w:hAnsi="Times New Roman" w:cs="Times New Roman"/>
+        </w:rPr>
+        <w:t>Balance_To_TC</w:t>
+      </w:r>
+      <w:proofErr w:type="spellEnd"/>
+      <w:r>
+        <w:rPr>
+          <w:rFonts w:ascii="Times New Roman" w:hAnsi="Times New Roman" w:cs="Times New Roman"/>
+        </w:rPr>
+        <w:t xml:space="preserve"> = </w:t>
+      </w:r>
+      <w:r>
+        <w:rPr>
+          <w:rFonts w:ascii="Times New Roman" w:hAnsi="Times New Roman" w:cs="Times New Roman"/>
+        </w:rPr>
+        <w:t>(Total Revolving Balance) / (Total Transaction Count)</w:t>
+      </w:r>
+    </w:p>
+    <w:p>
+      <w:pPr>
+        <w:pStyle w:val="ListParagraph"/>
+        <w:numPr>
+          <w:ilvl w:val="1"/>
+          <w:numId w:val="3"/>
+        </w:numPr>
+        <w:rPr>
+          <w:rFonts w:ascii="Times New Roman" w:hAnsi="Times New Roman" w:cs="Times New Roman"/>
+        </w:rPr>
+      </w:pPr>
+      <w:r>
+        <w:rPr>
+          <w:rFonts w:ascii="Times New Roman" w:hAnsi="Times New Roman" w:cs="Times New Roman"/>
+        </w:rPr>
+        <w:t xml:space="preserve">A high revolving balance to transaction count ratio would imply the customer is spending large amounts with few transactions, or vice versa, which may have an impact on churn </w:t>
+      </w:r>
+      <w:proofErr w:type="gramStart"/>
+      <w:r>
+        <w:rPr>
+          <w:rFonts w:ascii="Times New Roman" w:hAnsi="Times New Roman" w:cs="Times New Roman"/>
+        </w:rPr>
+        <w:t>rate</w:t>
+      </w:r>
+      <w:proofErr w:type="gramEnd"/>
+      <w:r>
+        <w:rPr>
+          <w:rFonts w:ascii="Times New Roman" w:hAnsi="Times New Roman" w:cs="Times New Roman"/>
+        </w:rPr>
+        <w:t>.</w:t>
+      </w:r>
+    </w:p>
+    <w:p>
+      <w:pPr>
+        <w:pStyle w:val="ListParagraph"/>
+        <w:numPr>
+          <w:ilvl w:val="0"/>
+          <w:numId w:val="3"/>
+        </w:numPr>
+        <w:rPr>
+          <w:rFonts w:ascii="Times New Roman" w:hAnsi="Times New Roman" w:cs="Times New Roman"/>
+        </w:rPr>
+      </w:pPr>
+      <w:proofErr w:type="spellStart"/>
+      <w:r>
+        <w:rPr>
+          <w:rFonts w:ascii="Times New Roman" w:hAnsi="Times New Roman" w:cs="Times New Roman"/>
+        </w:rPr>
+        <w:t>Credit_Limit_Per_Income</w:t>
+      </w:r>
+      <w:proofErr w:type="spellEnd"/>
+      <w:r>
+        <w:rPr>
+          <w:rFonts w:ascii="Times New Roman" w:hAnsi="Times New Roman" w:cs="Times New Roman"/>
+        </w:rPr>
+        <w:t xml:space="preserve"> = Credit Limit / </w:t>
+      </w:r>
+      <w:proofErr w:type="spellStart"/>
+      <w:r>
+        <w:rPr>
+          <w:rFonts w:ascii="Times New Roman" w:hAnsi="Times New Roman" w:cs="Times New Roman"/>
+        </w:rPr>
+        <w:t>Numerical_</w:t>
+      </w:r>
+      <w:r>
+        <w:rPr>
+          <w:rFonts w:ascii="Times New Roman" w:hAnsi="Times New Roman" w:cs="Times New Roman"/>
+        </w:rPr>
+        <w:t>Income</w:t>
+      </w:r>
+      <w:proofErr w:type="spellEnd"/>
+    </w:p>
+    <w:p>
+      <w:pPr>
+        <w:pStyle w:val="ListParagraph"/>
+        <w:numPr>
+          <w:ilvl w:val="1"/>
+          <w:numId w:val="3"/>
+        </w:numPr>
+        <w:rPr>
+          <w:rFonts w:ascii="Times New Roman" w:hAnsi="Times New Roman" w:cs="Times New Roman"/>
+        </w:rPr>
+      </w:pPr>
+      <w:r>
+        <w:rPr>
+          <w:rFonts w:ascii="Times New Roman" w:hAnsi="Times New Roman" w:cs="Times New Roman"/>
+        </w:rPr>
+        <w:t>The income categories would be reduced to numerical representations. If customers have obtained a high credit limit relative to their income, it can be assumed they have high credit scores, for which the number of open accounts in good standing is a factor</w:t>
+      </w:r>
+      <w:r>
+        <w:rPr>
+          <w:rFonts w:ascii="Times New Roman" w:hAnsi="Times New Roman" w:cs="Times New Roman"/>
+        </w:rPr>
+        <w:t>.</w:t>
+      </w:r>
+    </w:p>
+    <w:p>
+      <w:pPr>
+        <w:pStyle w:val="ListParagraph"/>
+        <w:numPr>
+          <w:ilvl w:val="0"/>
+          <w:numId w:val="3"/>
+        </w:numPr>
+        <w:rPr>
+          <w:rFonts w:ascii="Times New Roman" w:hAnsi="Times New Roman" w:cs="Times New Roman"/>
+        </w:rPr>
+      </w:pPr>
+      <w:proofErr w:type="spellStart"/>
+      <w:r>
+        <w:rPr>
+          <w:rFonts w:ascii="Times New Roman" w:hAnsi="Times New Roman" w:cs="Times New Roman"/>
+        </w:rPr>
+        <w:t>Leveraged_Balance_Ratio</w:t>
+      </w:r>
+      <w:proofErr w:type="spellEnd"/>
+      <w:r>
+        <w:rPr>
+          <w:rFonts w:ascii="Times New Roman" w:hAnsi="Times New Roman" w:cs="Times New Roman"/>
+        </w:rPr>
+        <w:t xml:space="preserve"> = (Total Transaction Amount) / (Average Utilization Ratio * Credit Limit)</w:t>
+      </w:r>
+    </w:p>
+    <w:p>
+      <w:pPr>
+        <w:pStyle w:val="ListParagraph"/>
+        <w:numPr>
+          <w:ilvl w:val="1"/>
+          <w:numId w:val="3"/>
+        </w:numPr>
+        <w:rPr>
+          <w:rFonts w:ascii="Times New Roman" w:hAnsi="Times New Roman" w:cs="Times New Roman"/>
+        </w:rPr>
+      </w:pPr>
+      <w:r>
+        <w:rPr>
+          <w:rFonts w:ascii="Times New Roman" w:hAnsi="Times New Roman" w:cs="Times New Roman"/>
+        </w:rPr>
+        <w:t xml:space="preserve">This feature is an </w:t>
+      </w:r>
+      <w:r>
+        <w:rPr>
+          <w:rFonts w:ascii="Times New Roman" w:hAnsi="Times New Roman" w:cs="Times New Roman"/>
+        </w:rPr>
+        <w:t>indication of how capable the customer is of paying their balance, normalized to their credit limit.</w:t>
+      </w:r>
+    </w:p>
+    <w:p>
+      <w:pPr>
+        <w:pStyle w:val="ListParagraph"/>
+        <w:numPr>
+          <w:ilvl w:val="0"/>
+          <w:numId w:val="3"/>
+        </w:numPr>
+        <w:rPr>
+          <w:rFonts w:ascii="Times New Roman" w:hAnsi="Times New Roman" w:cs="Times New Roman"/>
+        </w:rPr>
+      </w:pPr>
+      <w:proofErr w:type="spellStart"/>
+      <w:r>
+        <w:rPr>
+          <w:rFonts w:ascii="Times New Roman" w:hAnsi="Times New Roman" w:cs="Times New Roman"/>
+        </w:rPr>
+        <w:t>Relationship_Strength</w:t>
+      </w:r>
+      <w:proofErr w:type="spellEnd"/>
+      <w:r>
+        <w:rPr>
+          <w:rFonts w:ascii="Times New Roman" w:hAnsi="Times New Roman" w:cs="Times New Roman"/>
+        </w:rPr>
+        <w:t xml:space="preserve"> = Months on Book * Total Relationship Count</w:t>
+      </w:r>
+    </w:p>
+    <w:p>
+      <w:pPr>
+        <w:pStyle w:val="ListParagraph"/>
+        <w:numPr>
+          <w:ilvl w:val="1"/>
+          <w:numId w:val="3"/>
+        </w:numPr>
+        <w:rPr>
+          <w:rFonts w:ascii="Times New Roman" w:hAnsi="Times New Roman" w:cs="Times New Roman"/>
+        </w:rPr>
+      </w:pPr>
+      <w:r>
+        <w:rPr>
+          <w:rFonts w:ascii="Times New Roman" w:hAnsi="Times New Roman" w:cs="Times New Roman"/>
+        </w:rPr>
+        <w:t xml:space="preserve">A representation of </w:t>
+      </w:r>
+      <w:r>
+        <w:rPr>
+          <w:rFonts w:ascii="Times New Roman" w:hAnsi="Times New Roman" w:cs="Times New Roman"/>
+        </w:rPr>
+        <w:t>the strength of the relationship the customer has with the bank. A higher value indicates a stronger relationship, as customers that are heavily invested in the products and services the bank provides may be less likely to stop utilizing the bank</w:t>
+      </w:r>
+      <w:r>
+        <w:rPr>
+          <w:rFonts w:ascii="Times New Roman" w:hAnsi="Times New Roman" w:cs="Times New Roman"/>
+        </w:rPr>
+        <w:t>.</w:t>
+      </w:r>
+    </w:p>
+    <w:p>
+      <w:pPr>
+        <w:ind w:firstLine="720"/>
+        <w:rPr>
+          <w:rFonts w:ascii="Times New Roman" w:hAnsi="Times New Roman" w:cs="Times New Roman"/>
+        </w:rPr>
+      </w:pPr>
+      <w:r>
+        <w:rPr>
+          <w:rFonts w:ascii="Times New Roman" w:hAnsi="Times New Roman" w:cs="Times New Roman"/>
+        </w:rPr>
+        <w:t xml:space="preserve">A feature worth highlighting is </w:t>
+      </w:r>
+      <w:proofErr w:type="spellStart"/>
+      <w:r>
+        <w:rPr>
+          <w:rFonts w:ascii="Times New Roman" w:hAnsi="Times New Roman" w:cs="Times New Roman"/>
+        </w:rPr>
+        <w:t>Credit_Limit_Per_Income</w:t>
+      </w:r>
+      <w:proofErr w:type="spellEnd"/>
+      <w:r>
+        <w:rPr>
+          <w:rFonts w:ascii="Times New Roman" w:hAnsi="Times New Roman" w:cs="Times New Roman"/>
+        </w:rPr>
+        <w:t>, which p</w:t>
+      </w:r>
+      <w:r>
+        <w:rPr>
+          <w:rFonts w:ascii="Times New Roman" w:hAnsi="Times New Roman" w:cs="Times New Roman"/>
+        </w:rPr>
+        <w:t>roved to be far more difficult to implement than initially thought. The</w:t>
+      </w:r>
+      <w:r>
+        <w:rPr>
+          <w:rFonts w:ascii="Times New Roman" w:hAnsi="Times New Roman" w:cs="Times New Roman"/>
+        </w:rPr>
+        <w:t xml:space="preserve"> </w:t>
+      </w:r>
+      <w:proofErr w:type="spellStart"/>
+      <w:r>
+        <w:rPr>
+          <w:rFonts w:ascii="Times New Roman" w:hAnsi="Times New Roman" w:cs="Times New Roman"/>
+        </w:rPr>
+        <w:t>Income_Category</w:t>
+      </w:r>
+      <w:proofErr w:type="spellEnd"/>
+      <w:r>
+        <w:rPr>
+          <w:rFonts w:ascii="Times New Roman" w:hAnsi="Times New Roman" w:cs="Times New Roman"/>
+        </w:rPr>
+        <w:t xml:space="preserve"> variable is categorical in nature, </w:t>
+      </w:r>
+      <w:r>
+        <w:rPr>
+          <w:rFonts w:ascii="Times New Roman" w:hAnsi="Times New Roman" w:cs="Times New Roman"/>
+        </w:rPr>
+        <w:t xml:space="preserve">therefore requiring a conversion to a numerical format </w:t>
+      </w:r>
+      <w:proofErr w:type="gramStart"/>
+      <w:r>
+        <w:rPr>
+          <w:rFonts w:ascii="Times New Roman" w:hAnsi="Times New Roman" w:cs="Times New Roman"/>
+        </w:rPr>
+        <w:t>in order to</w:t>
+      </w:r>
+      <w:proofErr w:type="gramEnd"/>
+      <w:r>
+        <w:rPr>
+          <w:rFonts w:ascii="Times New Roman" w:hAnsi="Times New Roman" w:cs="Times New Roman"/>
+        </w:rPr>
+        <w:t xml:space="preserve"> implement this feature.</w:t>
+      </w:r>
+      <w:r>
+        <w:rPr>
+          <w:rFonts w:ascii="Times New Roman" w:hAnsi="Times New Roman" w:cs="Times New Roman"/>
+        </w:rPr>
+        <w:t xml:space="preserve"> The categories representing </w:t>
+      </w:r>
+      <w:proofErr w:type="spellStart"/>
+      <w:r>
+        <w:rPr>
+          <w:rFonts w:ascii="Times New Roman" w:hAnsi="Times New Roman" w:cs="Times New Roman"/>
+        </w:rPr>
+        <w:t>Income_Category</w:t>
+      </w:r>
+      <w:proofErr w:type="spellEnd"/>
+      <w:r>
+        <w:rPr>
+          <w:rFonts w:ascii="Times New Roman" w:hAnsi="Times New Roman" w:cs="Times New Roman"/>
+        </w:rPr>
+        <w:t xml:space="preserve"> are </w:t>
+      </w:r>
+      <w:r>
+        <w:rPr>
+          <w:rFonts w:ascii="Times New Roman" w:hAnsi="Times New Roman" w:cs="Times New Roman"/>
+        </w:rPr>
+        <w:t xml:space="preserve">$60K - $80K, </w:t>
+      </w:r>
+      <w:proofErr w:type="gramStart"/>
+      <w:r>
+        <w:rPr>
+          <w:rFonts w:ascii="Times New Roman" w:hAnsi="Times New Roman" w:cs="Times New Roman"/>
+        </w:rPr>
+        <w:t>Less</w:t>
+      </w:r>
+      <w:proofErr w:type="gramEnd"/>
+      <w:r>
+        <w:rPr>
+          <w:rFonts w:ascii="Times New Roman" w:hAnsi="Times New Roman" w:cs="Times New Roman"/>
+        </w:rPr>
+        <w:t xml:space="preserve"> than $40K, $80K - $120K, $40K - $60K,</w:t>
+      </w:r>
+      <w:r>
+        <w:rPr>
+          <w:rFonts w:ascii="Times New Roman" w:hAnsi="Times New Roman" w:cs="Times New Roman"/>
+        </w:rPr>
+        <w:t xml:space="preserve"> </w:t>
+      </w:r>
+      <w:r>
+        <w:rPr>
+          <w:rFonts w:ascii="Times New Roman" w:hAnsi="Times New Roman" w:cs="Times New Roman"/>
+        </w:rPr>
+        <w:t>$120K +,</w:t>
+      </w:r>
+      <w:r>
+        <w:rPr>
+          <w:rFonts w:ascii="Times New Roman" w:hAnsi="Times New Roman" w:cs="Times New Roman"/>
+        </w:rPr>
+        <w:t xml:space="preserve"> and</w:t>
+      </w:r>
+      <w:r>
+        <w:rPr>
+          <w:rFonts w:ascii="Times New Roman" w:hAnsi="Times New Roman" w:cs="Times New Roman"/>
+        </w:rPr>
+        <w:t xml:space="preserve"> Unknown</w:t>
+      </w:r>
+      <w:r>
+        <w:rPr>
+          <w:rFonts w:ascii="Times New Roman" w:hAnsi="Times New Roman" w:cs="Times New Roman"/>
+        </w:rPr>
+        <w:t>.</w:t>
+      </w:r>
+    </w:p>
+    <w:p>
+      <w:pPr>
+        <w:ind w:firstLine="720"/>
+        <w:rPr>
+          <w:rFonts w:ascii="Times New Roman" w:hAnsi="Times New Roman" w:cs="Times New Roman"/>
+        </w:rPr>
+      </w:pPr>
+      <w:proofErr w:type="gramStart"/>
+      <w:r>
+        <w:rPr>
+          <w:rFonts w:ascii="Times New Roman" w:hAnsi="Times New Roman" w:cs="Times New Roman"/>
+        </w:rPr>
+        <w:t>In order to</w:t>
+      </w:r>
+      <w:proofErr w:type="gramEnd"/>
+      <w:r>
+        <w:rPr>
+          <w:rFonts w:ascii="Times New Roman" w:hAnsi="Times New Roman" w:cs="Times New Roman"/>
+        </w:rPr>
+        <w:t xml:space="preserve"> create a distribution of numerical incomes that fit the </w:t>
+      </w:r>
+      <w:r>
+        <w:rPr>
+          <w:rFonts w:ascii="Times New Roman" w:hAnsi="Times New Roman" w:cs="Times New Roman"/>
+        </w:rPr>
+        <w:t xml:space="preserve">correct proportion of categorical income values, a key assumption was made; credit limit </w:t>
+      </w:r>
+      <w:r>
+        <w:rPr>
+          <w:rFonts w:ascii="Times New Roman" w:hAnsi="Times New Roman" w:cs="Times New Roman"/>
+        </w:rPr>
+        <w:t xml:space="preserve">is proportional to income. Using this assumption, </w:t>
+      </w:r>
+      <w:r>
+        <w:rPr>
+          <w:rFonts w:ascii="Times New Roman" w:hAnsi="Times New Roman" w:cs="Times New Roman"/>
+        </w:rPr>
+        <w:t>credit limit</w:t>
+      </w:r>
+      <w:r>
+        <w:rPr>
+          <w:rFonts w:ascii="Times New Roman" w:hAnsi="Times New Roman" w:cs="Times New Roman"/>
+        </w:rPr>
+        <w:t xml:space="preserve"> histograms</w:t>
+      </w:r>
+      <w:r>
+        <w:rPr>
+          <w:rFonts w:ascii="Times New Roman" w:hAnsi="Times New Roman" w:cs="Times New Roman"/>
+        </w:rPr>
+        <w:t xml:space="preserve"> grouped by income category</w:t>
+      </w:r>
+      <w:r>
+        <w:rPr>
+          <w:rFonts w:ascii="Times New Roman" w:hAnsi="Times New Roman" w:cs="Times New Roman"/>
+        </w:rPr>
+        <w:t xml:space="preserve"> were generated to </w:t>
+      </w:r>
+      <w:r>
+        <w:rPr>
+          <w:rFonts w:ascii="Times New Roman" w:hAnsi="Times New Roman" w:cs="Times New Roman"/>
+        </w:rPr>
+        <w:t xml:space="preserve">understand the distribution of credit limits in </w:t>
+      </w:r>
+      <w:r>
+        <w:rPr>
+          <w:rFonts w:ascii="Times New Roman" w:hAnsi="Times New Roman" w:cs="Times New Roman"/>
+        </w:rPr>
+        <w:lastRenderedPageBreak/>
+        <w:t xml:space="preserve">each income category. An example of the </w:t>
+      </w:r>
+      <w:r>
+        <w:rPr>
+          <w:rFonts w:ascii="Times New Roman" w:hAnsi="Times New Roman" w:cs="Times New Roman"/>
+        </w:rPr>
+        <w:t xml:space="preserve">$60k-$80k </w:t>
+      </w:r>
+      <w:r>
+        <w:rPr>
+          <w:rFonts w:ascii="Times New Roman" w:hAnsi="Times New Roman" w:cs="Times New Roman"/>
+        </w:rPr>
+        <w:t xml:space="preserve">Income Category </w:t>
+      </w:r>
+      <w:r>
+        <w:rPr>
+          <w:rFonts w:ascii="Times New Roman" w:hAnsi="Times New Roman" w:cs="Times New Roman"/>
+        </w:rPr>
+        <w:t xml:space="preserve">grouped </w:t>
+      </w:r>
+      <w:r>
+        <w:rPr>
+          <w:rFonts w:ascii="Times New Roman" w:hAnsi="Times New Roman" w:cs="Times New Roman"/>
+        </w:rPr>
+        <w:t xml:space="preserve">Credit Limit </w:t>
+      </w:r>
+      <w:r>
+        <w:rPr>
+          <w:rFonts w:ascii="Times New Roman" w:hAnsi="Times New Roman" w:cs="Times New Roman"/>
+        </w:rPr>
+        <w:t xml:space="preserve">histogram can be </w:t>
+      </w:r>
+      <w:proofErr w:type="gramStart"/>
+      <w:r>
+        <w:rPr>
+          <w:rFonts w:ascii="Times New Roman" w:hAnsi="Times New Roman" w:cs="Times New Roman"/>
+        </w:rPr>
+        <w:t>seen,</w:t>
+      </w:r>
+      <w:proofErr w:type="gramEnd"/>
+      <w:r>
+        <w:rPr>
+          <w:rFonts w:ascii="Times New Roman" w:hAnsi="Times New Roman" w:cs="Times New Roman"/>
+        </w:rPr>
+        <w:t xml:space="preserve"> below:</w:t>
+      </w:r>
+    </w:p>
+    <w:p>
+      <w:pPr>
+        <w:ind w:firstLine="720"/>
+        <w:rPr>
+          <w:rFonts w:ascii="Times New Roman" w:hAnsi="Times New Roman" w:cs="Times New Roman"/>
+        </w:rPr>
+      </w:pPr>
+      <w:r>
+        <w:rPr>
+          <w:rFonts w:ascii="Times New Roman" w:hAnsi="Times New Roman" w:cs="Times New Roman"/>
+        </w:rPr>
+        <w:drawing>
+          <wp:inline distT="0" distB="0" distL="0" distR="0" wp14:anchorId="7D7A21DD" wp14:editId="18437C0C">
+            <wp:extent cx="6013564" cy="5025224"/>
+            <wp:effectExtent l="0" t="0" r="6350" b="4445"/>
+            <wp:docPr id="59694767" name="Picture 1" descr="A graph of a credit limit&#10;&#10;AI-generated content may be incorrect."/>
+            <wp:cNvGraphicFramePr>
+              <a:graphicFrameLocks xmlns:a="http://schemas.openxmlformats.org/drawingml/2006/main" noChangeAspect="1"/>
+            </wp:cNvGraphicFramePr>
+            <a:graphic xmlns:a="http://schemas.openxmlformats.org/drawingml/2006/main">
+              <a:graphicData uri="http://schemas.openxmlformats.org/drawingml/2006/picture">
+                <pic:pic xmlns:pic="http://schemas.openxmlformats.org/drawingml/2006/picture">
+                  <pic:nvPicPr>
+                    <pic:cNvPr id="59694767" name="Picture 1" descr="A graph of a credit limit&#10;&#10;AI-generated content may be incorrect."/>
+                    <pic:cNvPicPr/>
+                  </pic:nvPicPr>
+                  <pic:blipFill>
+                    <a:blip r:embed="rId5"/>
+                    <a:stretch>
+                      <a:fillRect/>
+                    </a:stretch>
+                  </pic:blipFill>
+                  <pic:spPr>
+                    <a:xfrm>
+                      <a:off x="0" y="0"/>
+                      <a:ext cx="6020862" cy="5031323"/>
+                    </a:xfrm>
+                    <a:prstGeom prst="rect">
+                      <a:avLst/>
+                    </a:prstGeom>
+                  </pic:spPr>
+                </pic:pic>
+              </a:graphicData>
+            </a:graphic>
+          </wp:inline>
+        </w:drawing>
+      </w:r>
+    </w:p>
+    <w:p>
+      <w:pPr>
+        <w:rPr>
+          <w:rFonts w:ascii="Times New Roman" w:hAnsi="Times New Roman" w:cs="Times New Roman"/>
+        </w:rPr>
+      </w:pPr>
+      <w:r>
+        <w:rPr>
+          <w:rFonts w:ascii="Times New Roman" w:hAnsi="Times New Roman" w:cs="Times New Roman"/>
+        </w:rPr>
+        <w:t xml:space="preserve">For each income category, the corresponding credit limit </w:t>
+      </w:r>
+      <w:r>
+        <w:rPr>
+          <w:rFonts w:ascii="Times New Roman" w:hAnsi="Times New Roman" w:cs="Times New Roman"/>
+        </w:rPr>
+        <w:t xml:space="preserve">values were </w:t>
+      </w:r>
+      <w:r>
+        <w:rPr>
+          <w:rFonts w:ascii="Times New Roman" w:hAnsi="Times New Roman" w:cs="Times New Roman"/>
+        </w:rPr>
+        <w:t xml:space="preserve">binned into </w:t>
+      </w:r>
+      <w:r>
+        <w:rPr>
+          <w:rFonts w:ascii="Times New Roman" w:hAnsi="Times New Roman" w:cs="Times New Roman"/>
+        </w:rPr>
+        <w:t xml:space="preserve">10 groups, for which the numerical Income Category </w:t>
+      </w:r>
+      <w:r>
+        <w:rPr>
+          <w:rFonts w:ascii="Times New Roman" w:hAnsi="Times New Roman" w:cs="Times New Roman"/>
+        </w:rPr>
+        <w:t xml:space="preserve">distribution would be based, as the assumption is that credit limit and Income are proportional. </w:t>
+      </w:r>
+      <w:r>
+        <w:rPr>
+          <w:rFonts w:ascii="Times New Roman" w:hAnsi="Times New Roman" w:cs="Times New Roman"/>
+        </w:rPr>
+        <w:t xml:space="preserve">For each </w:t>
+      </w:r>
+      <w:r>
+        <w:rPr>
+          <w:rFonts w:ascii="Times New Roman" w:hAnsi="Times New Roman" w:cs="Times New Roman"/>
+        </w:rPr>
+        <w:t xml:space="preserve">income category, the credit limit bin was mapped to the income range of the category, then random </w:t>
+      </w:r>
+      <w:r>
+        <w:rPr>
+          <w:rFonts w:ascii="Times New Roman" w:hAnsi="Times New Roman" w:cs="Times New Roman"/>
+        </w:rPr>
+        <w:t xml:space="preserve">values (random seed = 42) were generated within the corresponding income bin for the number of values </w:t>
+      </w:r>
+      <w:r>
+        <w:rPr>
+          <w:rFonts w:ascii="Times New Roman" w:hAnsi="Times New Roman" w:cs="Times New Roman"/>
+        </w:rPr>
+        <w:t xml:space="preserve">represented in the credit limit distribution. This results in a numerical Income </w:t>
+      </w:r>
+      <w:r>
+        <w:rPr>
+          <w:rFonts w:ascii="Times New Roman" w:hAnsi="Times New Roman" w:cs="Times New Roman"/>
+        </w:rPr>
+        <w:t>value</w:t>
+      </w:r>
+      <w:r>
+        <w:rPr>
+          <w:rFonts w:ascii="Times New Roman" w:hAnsi="Times New Roman" w:cs="Times New Roman"/>
+        </w:rPr>
+        <w:t xml:space="preserve"> that is mapped to the distribution of credit limi</w:t>
+      </w:r>
+      <w:r>
+        <w:rPr>
+          <w:rFonts w:ascii="Times New Roman" w:hAnsi="Times New Roman" w:cs="Times New Roman"/>
+        </w:rPr>
+        <w:t xml:space="preserve">ts for the initial income range. </w:t>
+      </w:r>
+      <w:r>
+        <w:rPr>
+          <w:rFonts w:ascii="Times New Roman" w:hAnsi="Times New Roman" w:cs="Times New Roman"/>
+        </w:rPr>
+        <w:t>To verify the results of this</w:t>
+      </w:r>
+      <w:r>
+        <w:rPr>
+          <w:rFonts w:ascii="Times New Roman" w:hAnsi="Times New Roman" w:cs="Times New Roman"/>
+        </w:rPr>
+        <w:t xml:space="preserve"> transformation, histogram plots were created for the respective, numerical income ranges, seen below for numerical incomes in the </w:t>
+      </w:r>
+      <w:r>
+        <w:rPr>
+          <w:rFonts w:ascii="Times New Roman" w:hAnsi="Times New Roman" w:cs="Times New Roman"/>
+        </w:rPr>
+        <w:t>$</w:t>
+      </w:r>
+      <w:r>
+        <w:rPr>
+          <w:rFonts w:ascii="Times New Roman" w:hAnsi="Times New Roman" w:cs="Times New Roman"/>
+        </w:rPr>
+        <w:t>60</w:t>
+      </w:r>
+      <w:r>
+        <w:rPr>
+          <w:rFonts w:ascii="Times New Roman" w:hAnsi="Times New Roman" w:cs="Times New Roman"/>
+        </w:rPr>
+        <w:t>,000 to $80,000 range:</w:t>
+      </w:r>
+    </w:p>
+    <w:p>
+      <w:pPr>
+        <w:rPr>
+          <w:rFonts w:ascii="Times New Roman" w:hAnsi="Times New Roman" w:cs="Times New Roman"/>
+        </w:rPr>
+      </w:pPr>
+      <w:r>
+        <w:rPr>
+          <w:rFonts w:ascii="Times New Roman" w:hAnsi="Times New Roman" w:cs="Times New Roman"/>
+        </w:rPr>
+        <w:lastRenderedPageBreak/>
+        <w:drawing>
+          <wp:inline distT="0" distB="0" distL="0" distR="0" wp14:anchorId="51EC2B1A" wp14:editId="0B7D51AB">
+            <wp:extent cx="6858000" cy="5608955"/>
+            <wp:effectExtent l="0" t="0" r="0" b="0"/>
+            <wp:docPr id="1767348574" name="Picture 1" descr="A graph with blue and white squares&#10;&#10;AI-generated content may be incorrect."/>
+            <wp:cNvGraphicFramePr>
+              <a:graphicFrameLocks xmlns:a="http://schemas.openxmlformats.org/drawingml/2006/main" noChangeAspect="1"/>
+            </wp:cNvGraphicFramePr>
+            <a:graphic xmlns:a="http://schemas.openxmlformats.org/drawingml/2006/main">
+              <a:graphicData uri="http://schemas.openxmlformats.org/drawingml/2006/picture">
+                <pic:pic xmlns:pic="http://schemas.openxmlformats.org/drawingml/2006/picture">
+                  <pic:nvPicPr>
+                    <pic:cNvPr id="1767348574" name="Picture 1" descr="A graph with blue and white squares&#10;&#10;AI-generated content may be incorrect."/>
+                    <pic:cNvPicPr/>
+                  </pic:nvPicPr>
+                  <pic:blipFill>
+                    <a:blip r:embed="rId6"/>
+                    <a:stretch>
+                      <a:fillRect/>
+                    </a:stretch>
+                  </pic:blipFill>
+                  <pic:spPr>
+                    <a:xfrm>
+                      <a:off x="0" y="0"/>
+                      <a:ext cx="6858000" cy="5608955"/>
+                    </a:xfrm>
+                    <a:prstGeom prst="rect">
+                      <a:avLst/>
+                    </a:prstGeom>
+                  </pic:spPr>
+                </pic:pic>
+              </a:graphicData>
+            </a:graphic>
+          </wp:inline>
+        </w:drawing>
+      </w:r>
+    </w:p>
+    <w:p>
+      <w:pPr>
+        <w:rPr>
+          <w:rFonts w:ascii="Times New Roman" w:hAnsi="Times New Roman" w:cs="Times New Roman"/>
+        </w:rPr>
+      </w:pPr>
+      <w:r>
+        <w:rPr>
+          <w:rFonts w:ascii="Times New Roman" w:hAnsi="Times New Roman" w:cs="Times New Roman"/>
+        </w:rPr>
+        <w:t xml:space="preserve">Upon the completion of generating the Numerical Income variable, </w:t>
+      </w:r>
+      <w:r>
+        <w:rPr>
+          <w:rFonts w:ascii="Times New Roman" w:hAnsi="Times New Roman" w:cs="Times New Roman"/>
+        </w:rPr>
+        <w:t xml:space="preserve">the intended feature, </w:t>
+      </w:r>
+      <w:proofErr w:type="spellStart"/>
+      <w:r>
+        <w:rPr>
+          <w:rFonts w:ascii="Times New Roman" w:hAnsi="Times New Roman" w:cs="Times New Roman"/>
+        </w:rPr>
+        <w:t>Credit_Limit_Per_Income</w:t>
+      </w:r>
+      <w:proofErr w:type="spellEnd"/>
+      <w:r>
+        <w:rPr>
+          <w:rFonts w:ascii="Times New Roman" w:hAnsi="Times New Roman" w:cs="Times New Roman"/>
+        </w:rPr>
+        <w:t xml:space="preserve">, could be generated by dividing the credit limit </w:t>
+      </w:r>
+      <w:r>
+        <w:rPr>
+          <w:rFonts w:ascii="Times New Roman" w:hAnsi="Times New Roman" w:cs="Times New Roman"/>
+        </w:rPr>
+        <w:t xml:space="preserve">by </w:t>
+      </w:r>
+      <w:proofErr w:type="gramStart"/>
+      <w:r>
+        <w:rPr>
+          <w:rFonts w:ascii="Times New Roman" w:hAnsi="Times New Roman" w:cs="Times New Roman"/>
+        </w:rPr>
+        <w:t>the Numerical</w:t>
+      </w:r>
+      <w:proofErr w:type="gramEnd"/>
+      <w:r>
+        <w:rPr>
+          <w:rFonts w:ascii="Times New Roman" w:hAnsi="Times New Roman" w:cs="Times New Roman"/>
+        </w:rPr>
+        <w:t xml:space="preserve"> Income.</w:t>
+      </w:r>
+      <w:r>
+        <w:rPr>
+          <w:rFonts w:ascii="Times New Roman" w:hAnsi="Times New Roman" w:cs="Times New Roman"/>
+        </w:rPr>
+        <w:t xml:space="preserve"> </w:t>
+      </w:r>
+    </w:p>
+    <w:p>
+      <w:pPr>
+        <w:rPr>
+          <w:rFonts w:ascii="Times New Roman" w:hAnsi="Times New Roman" w:cs="Times New Roman"/>
+        </w:rPr>
+      </w:pPr>
+      <w:r>
+        <w:rPr>
+          <w:rFonts w:ascii="Times New Roman" w:hAnsi="Times New Roman" w:cs="Times New Roman"/>
+        </w:rPr>
+        <w:tab/>
+        <w:t>Lastly, the train</w:t>
+      </w:r>
+      <w:r>
+        <w:rPr>
+          <w:rFonts w:ascii="Times New Roman" w:hAnsi="Times New Roman" w:cs="Times New Roman"/>
+        </w:rPr>
+        <w:t>-</w:t>
+      </w:r>
+      <w:r>
+        <w:rPr>
+          <w:rFonts w:ascii="Times New Roman" w:hAnsi="Times New Roman" w:cs="Times New Roman"/>
+        </w:rPr>
+        <w:t xml:space="preserve">test split </w:t>
+      </w:r>
+      <w:r>
+        <w:rPr>
+          <w:rFonts w:ascii="Times New Roman" w:hAnsi="Times New Roman" w:cs="Times New Roman"/>
+        </w:rPr>
+        <w:t xml:space="preserve">selected for the entirety of the analysis was </w:t>
+      </w:r>
+      <w:r>
+        <w:rPr>
+          <w:rFonts w:ascii="Times New Roman" w:hAnsi="Times New Roman" w:cs="Times New Roman"/>
+        </w:rPr>
+        <w:t xml:space="preserve">80% train, 20% test with a </w:t>
+      </w:r>
+      <w:r>
+        <w:rPr>
+          <w:rFonts w:ascii="Times New Roman" w:hAnsi="Times New Roman" w:cs="Times New Roman"/>
+        </w:rPr>
+        <w:t xml:space="preserve">random seed of 42. </w:t>
+      </w:r>
+      <w:r>
+        <w:rPr>
+          <w:rFonts w:ascii="Times New Roman" w:hAnsi="Times New Roman" w:cs="Times New Roman"/>
+        </w:rPr>
+        <w:t>Stratifica</w:t>
+      </w:r>
+      <w:r>
+        <w:rPr>
+          <w:rFonts w:ascii="Times New Roman" w:hAnsi="Times New Roman" w:cs="Times New Roman"/>
+        </w:rPr>
+        <w:t xml:space="preserve">tion was done prior </w:t>
+      </w:r>
+      <w:r>
+        <w:rPr>
+          <w:rFonts w:ascii="Times New Roman" w:hAnsi="Times New Roman" w:cs="Times New Roman"/>
+        </w:rPr>
+        <w:t xml:space="preserve">to splitting data on the entirety of the data set, as detailed in the class imbalance correction </w:t>
+      </w:r>
+      <w:r>
+        <w:rPr>
+          <w:rFonts w:ascii="Times New Roman" w:hAnsi="Times New Roman" w:cs="Times New Roman"/>
+        </w:rPr>
+        <w:t xml:space="preserve">methodology </w:t>
+      </w:r>
+      <w:r>
+        <w:rPr>
+          <w:rFonts w:ascii="Times New Roman" w:hAnsi="Times New Roman" w:cs="Times New Roman"/>
+        </w:rPr>
+        <w:t>from the data cleaning and preparation section.</w:t>
+      </w:r>
+      <w:r>
+        <w:rPr>
+          <w:rFonts w:ascii="Times New Roman" w:hAnsi="Times New Roman" w:cs="Times New Roman"/>
+        </w:rPr>
+        <w:t xml:space="preserve"> </w:t>
+      </w:r>
+    </w:p>
+    <w:p>
+      <w:pPr>
+        <w:rPr>
+          <w:rFonts w:ascii="Times New Roman" w:hAnsi="Times New Roman" w:cs="Times New Roman"/>
+        </w:rPr>
+      </w:pPr>
+      <w:r>
+        <w:rPr>
+          <w:rFonts w:ascii="Times New Roman" w:hAnsi="Times New Roman" w:cs="Times New Roman"/>
+        </w:rPr>
+        <w:br w:type="page"/>
+      </w:r>
+    </w:p>
+    <w:p>
+      <w:pPr>
+        <w:pStyle w:val="Heading1"/>
+        <w:rPr>
+          <w:rFonts w:ascii="Times New Roman" w:hAnsi="Times New Roman" w:cs="Times New Roman"/>
+        </w:rPr>
+      </w:pPr>
+      <w:bookmarkStart w:id="1" w:name="_Toc206849144"/>
+      <w:r>
+        <w:rPr>
+          <w:rFonts w:ascii="Times New Roman" w:hAnsi="Times New Roman" w:cs="Times New Roman"/>
+        </w:rPr>
+        <w:lastRenderedPageBreak/>
+        <w:t>Model Implementation and Results</w:t>
+      </w:r>
+      <w:bookmarkEnd w:id="1"/>
+    </w:p>
+    <w:p>
+      <w:pPr>
+        <w:rPr>
+          <w:rFonts w:ascii="Times New Roman" w:hAnsi="Times New Roman" w:cs="Times New Roman"/>
+        </w:rPr>
+      </w:pPr>
+      <w:r>
         <w:rPr>
           <w:rFonts w:ascii="Times New Roman" w:hAnsi="Times New Roman" w:cs="Times New Roman"/>
         </w:rPr>
@@ -647,6 +2007,7 @@
       <w:r>
         <w:rPr>
           <w:rFonts w:ascii="Times New Roman" w:hAnsi="Times New Roman" w:cs="Times New Roman"/>
+          <w:noProof/>
         </w:rPr>
         <w:drawing>
           <wp:inline distT="0" distB="0" distL="0" distR="0" wp14:anchorId="4162DCF7" wp14:editId="567C6BA8">
@@ -664,7 +2025,7 @@
                     <pic:cNvPicPr/>
                   </pic:nvPicPr>
                   <pic:blipFill>
-                    <a:blip r:embed="rId5"/>
+                    <a:blip r:embed="rId7"/>
                     <a:stretch>
                       <a:fillRect/>
                     </a:stretch>
@@ -721,6 +2082,7 @@
       <w:r>
         <w:rPr>
           <w:rFonts w:ascii="Times New Roman" w:hAnsi="Times New Roman" w:cs="Times New Roman"/>
+          <w:noProof/>
         </w:rPr>
         <w:lastRenderedPageBreak/>
         <w:drawing>
@@ -739,7 +2101,7 @@
                     <pic:cNvPicPr/>
                   </pic:nvPicPr>
                   <pic:blipFill>
-                    <a:blip r:embed="rId6"/>
+                    <a:blip r:embed="rId8"/>
                     <a:stretch>
                       <a:fillRect/>
                     </a:stretch>
@@ -802,6 +2164,7 @@
       <w:r>
         <w:rPr>
           <w:rFonts w:ascii="Times New Roman" w:hAnsi="Times New Roman" w:cs="Times New Roman"/>
+          <w:noProof/>
         </w:rPr>
         <w:drawing>
           <wp:inline distT="0" distB="0" distL="0" distR="0" wp14:anchorId="40990D7D" wp14:editId="48E65CF8">
@@ -819,7 +2182,7 @@
                     <pic:cNvPicPr/>
                   </pic:nvPicPr>
                   <pic:blipFill>
-                    <a:blip r:embed="rId7"/>
+                    <a:blip r:embed="rId9"/>
                     <a:stretch>
                       <a:fillRect/>
                     </a:stretch>
@@ -857,25 +2220,7 @@
         <w:rPr>
           <w:rFonts w:ascii="Times New Roman" w:hAnsi="Times New Roman" w:cs="Times New Roman"/>
         </w:rPr>
-        <w:t>3</w:t>
-      </w:r>
-      <w:r>
-        <w:rPr>
-          <w:rFonts w:ascii="Times New Roman" w:hAnsi="Times New Roman" w:cs="Times New Roman"/>
-        </w:rPr>
-        <w:t xml:space="preserve">: </w:t>
-      </w:r>
-      <w:r>
-        <w:rPr>
-          <w:rFonts w:ascii="Times New Roman" w:hAnsi="Times New Roman" w:cs="Times New Roman"/>
-        </w:rPr>
-        <w:t>KNN</w:t>
-      </w:r>
-      <w:r>
-        <w:rPr>
-          <w:rFonts w:ascii="Times New Roman" w:hAnsi="Times New Roman" w:cs="Times New Roman"/>
-        </w:rPr>
-        <w:t xml:space="preserve"> </w:t>
+        <w:t xml:space="preserve">3: KNN </w:t>
       </w:r>
       <w:r>
         <w:rPr>
@@ -1522,6 +2867,7 @@
       <w:r>
         <w:rPr>
           <w:rFonts w:ascii="Times New Roman" w:hAnsi="Times New Roman" w:cs="Times New Roman"/>
+          <w:noProof/>
         </w:rPr>
         <w:drawing>
           <wp:inline distT="0" distB="0" distL="0" distR="0" wp14:anchorId="3984C8F2" wp14:editId="5C1AC52E">
@@ -1539,7 +2885,7 @@
                     <pic:cNvPicPr/>
                   </pic:nvPicPr>
                   <pic:blipFill>
-                    <a:blip r:embed="rId8"/>
+                    <a:blip r:embed="rId10"/>
                     <a:stretch>
                       <a:fillRect/>
                     </a:stretch>
@@ -1597,6 +2943,7 @@
       <w:r>
         <w:rPr>
           <w:rFonts w:ascii="Times New Roman" w:hAnsi="Times New Roman" w:cs="Times New Roman"/>
+          <w:noProof/>
         </w:rPr>
         <w:lastRenderedPageBreak/>
         <w:drawing>
@@ -1615,7 +2962,7 @@
                     <pic:cNvPicPr/>
                   </pic:nvPicPr>
                   <pic:blipFill>
-                    <a:blip r:embed="rId9"/>
+                    <a:blip r:embed="rId11"/>
                     <a:stretch>
                       <a:fillRect/>
                     </a:stretch>
@@ -1647,31 +2994,7 @@
         <w:rPr>
           <w:rFonts w:ascii="Times New Roman" w:hAnsi="Times New Roman" w:cs="Times New Roman"/>
         </w:rPr>
-        <w:t xml:space="preserve">Image </w:t>
-      </w:r>
-      <w:r>
-        <w:rPr>
-          <w:rFonts w:ascii="Times New Roman" w:hAnsi="Times New Roman" w:cs="Times New Roman"/>
-        </w:rPr>
-        <w:t>5</w:t>
-      </w:r>
-      <w:r>
-        <w:rPr>
-          <w:rFonts w:ascii="Times New Roman" w:hAnsi="Times New Roman" w:cs="Times New Roman"/>
-        </w:rPr>
-        <w:t xml:space="preserve">: Optimized </w:t>
-      </w:r>
-      <w:r>
-        <w:rPr>
-          <w:rFonts w:ascii="Times New Roman" w:hAnsi="Times New Roman" w:cs="Times New Roman"/>
-        </w:rPr>
-        <w:t>QDA</w:t>
-      </w:r>
-      <w:r>
-        <w:rPr>
-          <w:rFonts w:ascii="Times New Roman" w:hAnsi="Times New Roman" w:cs="Times New Roman"/>
-        </w:rPr>
-        <w:t xml:space="preserve"> Model Confusion Matrix and ROC Curve</w:t>
+        <w:t>Image 5: Optimized QDA Model Confusion Matrix and ROC Curve</w:t>
       </w:r>
     </w:p>
     <w:p>
@@ -1684,6 +3007,7 @@
       <w:r>
         <w:rPr>
           <w:rFonts w:ascii="Times New Roman" w:hAnsi="Times New Roman" w:cs="Times New Roman"/>
+          <w:noProof/>
         </w:rPr>
         <w:drawing>
           <wp:inline distT="0" distB="0" distL="0" distR="0" wp14:anchorId="39DEC98C" wp14:editId="145E85CE">
@@ -1701,7 +3025,7 @@
                     <pic:cNvPicPr/>
                   </pic:nvPicPr>
                   <pic:blipFill>
-                    <a:blip r:embed="rId10"/>
+                    <a:blip r:embed="rId12"/>
                     <a:stretch>
                       <a:fillRect/>
                     </a:stretch>
@@ -1733,31 +3057,7 @@
         <w:rPr>
           <w:rFonts w:ascii="Times New Roman" w:hAnsi="Times New Roman" w:cs="Times New Roman"/>
         </w:rPr>
-        <w:t xml:space="preserve">Image </w:t>
-      </w:r>
-      <w:r>
-        <w:rPr>
-          <w:rFonts w:ascii="Times New Roman" w:hAnsi="Times New Roman" w:cs="Times New Roman"/>
-        </w:rPr>
-        <w:t>6</w:t>
-      </w:r>
-      <w:r>
-        <w:rPr>
-          <w:rFonts w:ascii="Times New Roman" w:hAnsi="Times New Roman" w:cs="Times New Roman"/>
-        </w:rPr>
-        <w:t xml:space="preserve">: Optimized </w:t>
-      </w:r>
-      <w:r>
-        <w:rPr>
-          <w:rFonts w:ascii="Times New Roman" w:hAnsi="Times New Roman" w:cs="Times New Roman"/>
-        </w:rPr>
-        <w:t>KNN</w:t>
-      </w:r>
-      <w:r>
-        <w:rPr>
-          <w:rFonts w:ascii="Times New Roman" w:hAnsi="Times New Roman" w:cs="Times New Roman"/>
-        </w:rPr>
-        <w:t xml:space="preserve"> Model Confusion Matrix and ROC Curve</w:t>
+        <w:t>Image 6: Optimized KNN Model Confusion Matrix and ROC Curve</w:t>
       </w:r>
     </w:p>
     <w:p>
@@ -1772,11 +3072,6 @@
         </w:rPr>
         <w:lastRenderedPageBreak/>
         <w:tab/>
-      </w:r>
-      <w:r>
-        <w:rPr>
-          <w:rFonts w:ascii="Times New Roman" w:hAnsi="Times New Roman" w:cs="Times New Roman"/>
-        </w:rPr>
         <w:t xml:space="preserve">Critical performance metrics for the </w:t>
       </w:r>
       <w:r>
@@ -1789,25 +3084,7 @@
         <w:rPr>
           <w:rFonts w:ascii="Times New Roman" w:hAnsi="Times New Roman" w:cs="Times New Roman"/>
         </w:rPr>
-        <w:t xml:space="preserve"> Models are found in Table </w:t>
-      </w:r>
-      <w:r>
-        <w:rPr>
-          <w:rFonts w:ascii="Times New Roman" w:hAnsi="Times New Roman" w:cs="Times New Roman"/>
-        </w:rPr>
-        <w:t>2</w:t>
-      </w:r>
-      <w:r>
-        <w:rPr>
-          <w:rFonts w:ascii="Times New Roman" w:hAnsi="Times New Roman" w:cs="Times New Roman"/>
-        </w:rPr>
-        <w:t>, below</w:t>
-      </w:r>
-      <w:r>
-        <w:rPr>
-          <w:rFonts w:ascii="Times New Roman" w:hAnsi="Times New Roman" w:cs="Times New Roman"/>
-        </w:rPr>
-        <w:t>:</w:t>
+        <w:t xml:space="preserve"> Models are found in Table 2, below:</w:t>
       </w:r>
     </w:p>
     <w:tbl>
@@ -2141,13 +3418,7 @@
         <w:rPr>
           <w:rFonts w:ascii="Times New Roman" w:hAnsi="Times New Roman" w:cs="Times New Roman"/>
         </w:rPr>
-        <w:t>Table 2: Optimized</w:t>
-      </w:r>
-      <w:r>
-        <w:rPr>
-          <w:rFonts w:ascii="Times New Roman" w:hAnsi="Times New Roman" w:cs="Times New Roman"/>
-        </w:rPr>
-        <w:t xml:space="preserve"> Model Performance Metrics</w:t>
+        <w:t>Table 2: Optimized Model Performance Metrics</w:t>
       </w:r>
     </w:p>
     <w:p>
@@ -2188,14 +3459,14 @@
           <w:rFonts w:ascii="Times New Roman" w:hAnsi="Times New Roman" w:cs="Times New Roman"/>
         </w:rPr>
       </w:pPr>
-      <w:bookmarkStart w:id="1" w:name="_Toc205742930"/>
+      <w:bookmarkStart w:id="2" w:name="_Toc206849145"/>
       <w:r>
         <w:rPr>
           <w:rFonts w:ascii="Times New Roman" w:hAnsi="Times New Roman" w:cs="Times New Roman"/>
         </w:rPr>
         <w:t>Robust Variable Selection Process</w:t>
       </w:r>
-      <w:bookmarkEnd w:id="1"/>
+      <w:bookmarkEnd w:id="2"/>
     </w:p>
     <w:p>
       <w:pPr>
@@ -2249,13 +3520,7 @@
         <w:rPr>
           <w:rFonts w:ascii="Times New Roman" w:hAnsi="Times New Roman" w:cs="Times New Roman"/>
         </w:rPr>
-        <w:t xml:space="preserve">using </w:t>
-      </w:r>
-      <w:r>
-        <w:rPr>
-          <w:rFonts w:ascii="Times New Roman" w:hAnsi="Times New Roman" w:cs="Times New Roman"/>
-        </w:rPr>
-        <w:t xml:space="preserve">Mallow’s </w:t>
+        <w:t xml:space="preserve">using Mallow’s </w:t>
       </w:r>
       <w:r>
         <w:rPr>
@@ -2309,7 +3574,7 @@
                     <pic:cNvPicPr/>
                   </pic:nvPicPr>
                   <pic:blipFill>
-                    <a:blip r:embed="rId11">
+                    <a:blip r:embed="rId13">
                       <a:extLst>
                         <a:ext uri="{28A0092B-C50C-407E-A947-70E740481C1C}">
                           <a14:useLocalDpi xmlns:a14="http://schemas.microsoft.com/office/drawing/2010/main" val="0"/>
@@ -3776,19 +5041,7 @@
         <w:rPr>
           <w:rFonts w:ascii="Times New Roman" w:hAnsi="Times New Roman" w:cs="Times New Roman"/>
         </w:rPr>
-        <w:t xml:space="preserve"> from the Null model to the optimized </w:t>
-      </w:r>
-      <w:r>
-        <w:rPr>
-          <w:rFonts w:ascii="Times New Roman" w:hAnsi="Times New Roman" w:cs="Times New Roman"/>
-        </w:rPr>
-        <w:t>configuration</w:t>
-      </w:r>
-      <w:r>
-        <w:rPr>
-          <w:rFonts w:ascii="Times New Roman" w:hAnsi="Times New Roman" w:cs="Times New Roman"/>
-        </w:rPr>
-        <w:t>.</w:t>
+        <w:t xml:space="preserve"> from the Null model to the optimized configuration.</w:t>
       </w:r>
     </w:p>
     <w:tbl>
@@ -4427,14 +5680,14 @@
           <w:rFonts w:ascii="Times New Roman" w:hAnsi="Times New Roman" w:cs="Times New Roman"/>
         </w:rPr>
       </w:pPr>
-      <w:bookmarkStart w:id="2" w:name="_Toc205742931"/>
+      <w:bookmarkStart w:id="3" w:name="_Toc206849146"/>
       <w:r>
         <w:rPr>
           <w:rFonts w:ascii="Times New Roman" w:hAnsi="Times New Roman" w:cs="Times New Roman"/>
         </w:rPr>
         <w:t>Model Comparison</w:t>
       </w:r>
-      <w:bookmarkEnd w:id="2"/>
+      <w:bookmarkEnd w:id="3"/>
     </w:p>
     <w:p>
       <w:pPr>
@@ -4697,25 +5950,7 @@
               <w:rPr>
                 <w:rFonts w:ascii="Times New Roman" w:hAnsi="Times New Roman" w:cs="Times New Roman"/>
               </w:rPr>
-              <w:t>90</w:t>
-            </w:r>
-            <w:r>
-              <w:rPr>
-                <w:rFonts w:ascii="Times New Roman" w:hAnsi="Times New Roman" w:cs="Times New Roman"/>
-              </w:rPr>
-              <w:t>.</w:t>
-            </w:r>
-            <w:r>
-              <w:rPr>
-                <w:rFonts w:ascii="Times New Roman" w:hAnsi="Times New Roman" w:cs="Times New Roman"/>
-              </w:rPr>
-              <w:t>13</w:t>
-            </w:r>
-            <w:r>
-              <w:rPr>
-                <w:rFonts w:ascii="Times New Roman" w:hAnsi="Times New Roman" w:cs="Times New Roman"/>
-              </w:rPr>
-              <w:t>%</w:t>
+              <w:t>90.13%</w:t>
             </w:r>
           </w:p>
         </w:tc>
@@ -5083,19 +6318,7 @@
               <w:rPr>
                 <w:rFonts w:ascii="Times New Roman" w:hAnsi="Times New Roman" w:cs="Times New Roman"/>
               </w:rPr>
-              <w:t xml:space="preserve"> – </w:t>
-            </w:r>
-            <w:r>
-              <w:rPr>
-                <w:rFonts w:ascii="Times New Roman" w:hAnsi="Times New Roman" w:cs="Times New Roman"/>
-              </w:rPr>
-              <w:t>65%</w:t>
-            </w:r>
-            <w:r>
-              <w:rPr>
-                <w:rFonts w:ascii="Times New Roman" w:hAnsi="Times New Roman" w:cs="Times New Roman"/>
-              </w:rPr>
-              <w:t xml:space="preserve"> Reduction</w:t>
+              <w:t xml:space="preserve"> – 65% Reduction</w:t>
             </w:r>
           </w:p>
         </w:tc>
@@ -5479,19 +6702,7 @@
               <w:rPr>
                 <w:rFonts w:ascii="Times New Roman" w:hAnsi="Times New Roman" w:cs="Times New Roman"/>
               </w:rPr>
-              <w:t xml:space="preserve"> – </w:t>
-            </w:r>
-            <w:r>
-              <w:rPr>
-                <w:rFonts w:ascii="Times New Roman" w:hAnsi="Times New Roman" w:cs="Times New Roman"/>
-              </w:rPr>
-              <w:t>7</w:t>
-            </w:r>
-            <w:r>
-              <w:rPr>
-                <w:rFonts w:ascii="Times New Roman" w:hAnsi="Times New Roman" w:cs="Times New Roman"/>
-              </w:rPr>
-              <w:t>5% Reduction</w:t>
+              <w:t xml:space="preserve"> – 75% Reduction</w:t>
             </w:r>
           </w:p>
         </w:tc>
@@ -6239,19 +7450,7 @@
               <w:rPr>
                 <w:rFonts w:ascii="Times New Roman" w:hAnsi="Times New Roman" w:cs="Times New Roman"/>
               </w:rPr>
-              <w:t xml:space="preserve">Initial Variable Selection – </w:t>
-            </w:r>
-            <w:r>
-              <w:rPr>
-                <w:rFonts w:ascii="Times New Roman" w:hAnsi="Times New Roman" w:cs="Times New Roman"/>
-              </w:rPr>
-              <w:t>65%</w:t>
-            </w:r>
-            <w:r>
-              <w:rPr>
-                <w:rFonts w:ascii="Times New Roman" w:hAnsi="Times New Roman" w:cs="Times New Roman"/>
-              </w:rPr>
-              <w:t xml:space="preserve"> Reduction</w:t>
+              <w:t>Initial Variable Selection – 65% Reduction</w:t>
             </w:r>
           </w:p>
         </w:tc>
@@ -6617,19 +7816,7 @@
               <w:rPr>
                 <w:rFonts w:ascii="Times New Roman" w:hAnsi="Times New Roman" w:cs="Times New Roman"/>
               </w:rPr>
-              <w:t xml:space="preserve">Initial Variable Selection – </w:t>
-            </w:r>
-            <w:r>
-              <w:rPr>
-                <w:rFonts w:ascii="Times New Roman" w:hAnsi="Times New Roman" w:cs="Times New Roman"/>
-              </w:rPr>
-              <w:t>7</w:t>
-            </w:r>
-            <w:r>
-              <w:rPr>
-                <w:rFonts w:ascii="Times New Roman" w:hAnsi="Times New Roman" w:cs="Times New Roman"/>
-              </w:rPr>
-              <w:t>5% Reduction</w:t>
+              <w:t>Initial Variable Selection – 75% Reduction</w:t>
             </w:r>
           </w:p>
         </w:tc>
@@ -7379,19 +8566,7 @@
               <w:rPr>
                 <w:rFonts w:ascii="Times New Roman" w:hAnsi="Times New Roman" w:cs="Times New Roman"/>
               </w:rPr>
-              <w:t xml:space="preserve">Stepwise Selected Variables- </w:t>
-            </w:r>
-            <w:r>
-              <w:rPr>
-                <w:rFonts w:ascii="Times New Roman" w:hAnsi="Times New Roman" w:cs="Times New Roman"/>
-              </w:rPr>
-              <w:t xml:space="preserve">65% </w:t>
-            </w:r>
-            <w:r>
-              <w:rPr>
-                <w:rFonts w:ascii="Times New Roman" w:hAnsi="Times New Roman" w:cs="Times New Roman"/>
-              </w:rPr>
-              <w:t>Reduction</w:t>
+              <w:t>Stepwise Selected Variables- 65% Reduction</w:t>
             </w:r>
           </w:p>
         </w:tc>
@@ -7765,19 +8940,7 @@
               <w:rPr>
                 <w:rFonts w:ascii="Times New Roman" w:hAnsi="Times New Roman" w:cs="Times New Roman"/>
               </w:rPr>
-              <w:t xml:space="preserve">Stepwise Selected Variables- </w:t>
-            </w:r>
-            <w:r>
-              <w:rPr>
-                <w:rFonts w:ascii="Times New Roman" w:hAnsi="Times New Roman" w:cs="Times New Roman"/>
-              </w:rPr>
-              <w:t>7</w:t>
-            </w:r>
-            <w:r>
-              <w:rPr>
-                <w:rFonts w:ascii="Times New Roman" w:hAnsi="Times New Roman" w:cs="Times New Roman"/>
-              </w:rPr>
-              <w:t>5% Reduction</w:t>
+              <w:t>Stepwise Selected Variables- 75% Reduction</w:t>
             </w:r>
           </w:p>
         </w:tc>
@@ -8668,7 +9831,7 @@
           <w:rFonts w:ascii="Times New Roman" w:hAnsi="Times New Roman" w:cs="Times New Roman"/>
         </w:rPr>
       </w:pPr>
-      <w:bookmarkStart w:id="3" w:name="_Toc205742932"/>
+      <w:bookmarkStart w:id="4" w:name="_Toc206849147"/>
       <w:r>
         <w:rPr>
           <w:rFonts w:ascii="Times New Roman" w:hAnsi="Times New Roman" w:cs="Times New Roman"/>
@@ -8682,7 +9845,7 @@
         </w:rPr>
         <w:t>ecommendations for Phase 3</w:t>
       </w:r>
-      <w:bookmarkEnd w:id="3"/>
+      <w:bookmarkEnd w:id="4"/>
     </w:p>
     <w:p>
       <w:pPr>
@@ -8928,6 +10091,95 @@
 <file path=word/numbering.xml><?xml version="1.0" encoding="utf-8"?>
 <w:numbering xmlns:wpc="http://schemas.microsoft.com/office/word/2010/wordprocessingCanvas" xmlns:cx="http://schemas.microsoft.com/office/drawing/2014/chartex" xmlns:cx1="http://schemas.microsoft.com/office/drawing/2015/9/8/chartex" xmlns:cx2="http://schemas.microsoft.com/office/drawing/2015/10/21/chartex" xmlns:cx3="http://schemas.microsoft.com/office/drawing/2016/5/9/chartex" xmlns:cx4="http://schemas.microsoft.com/office/drawing/2016/5/10/chartex" xmlns:cx5="http://schemas.microsoft.com/office/drawing/2016/5/11/chartex" xmlns:cx6="http://schemas.microsoft.com/office/drawing/2016/5/12/chartex" xmlns:cx7="http://schemas.microsoft.com/office/drawing/2016/5/13/chartex" xmlns:cx8="http://schemas.microsoft.com/office/drawing/2016/5/14/chartex" xmlns:mc="http://schemas.openxmlformats.org/markup-compatibility/2006" xmlns:aink="http://schemas.microsoft.com/office/drawing/2016/ink" xmlns:am3d="http://schemas.microsoft.com/office/drawing/2017/model3d" xmlns:o="urn:schemas-microsoft-com:office:office" xmlns:oel="http://schemas.microsoft.com/office/2019/extlst" xmlns:r="http://schemas.openxmlformats.org/officeDocument/2006/relationships" xmlns:m="http://schemas.openxmlformats.org/officeDocument/2006/math" xmlns:v="urn:schemas-microsoft-com:vml" xmlns:wp14="http://schemas.microsoft.com/office/word/2010/wordprocessingDrawing" xmlns:wp="http://schemas.openxmlformats.org/drawingml/2006/wordprocessingDrawing" xmlns:w10="urn:schemas-microsoft-com:office:word" xmlns:w="http://schemas.openxmlformats.org/wordprocessingml/2006/main" xmlns:w14="http://schemas.microsoft.com/office/word/2010/wordml" xmlns:w15="http://schemas.microsoft.com/office/word/2012/wordml" xmlns:w16cex="http://schemas.microsoft.com/office/word/2018/wordml/cex" xmlns:w16cid="http://schemas.microsoft.com/office/word/2016/wordml/cid" xmlns:w16="http://schemas.microsoft.com/office/word/2018/wordml" xmlns:w16du="http://schemas.microsoft.com/office/word/2023/wordml/word16du" xmlns:w16sdtdh="http://schemas.microsoft.com/office/word/2020/wordml/sdtdatahash" xmlns:w16sdtfl="http://schemas.microsoft.com/office/word/2024/wordml/sdtformatlock" xmlns:w16se="http://schemas.microsoft.com/office/word/2015/wordml/symex" xmlns:wpg="http://schemas.microsoft.com/office/word/2010/wordprocessingGroup" xmlns:wpi="http://schemas.microsoft.com/office/word/2010/wordprocessingInk" xmlns:wne="http://schemas.microsoft.com/office/word/2006/wordml" xmlns:wps="http://schemas.microsoft.com/office/word/2010/wordprocessingShape" mc:Ignorable="w14 w15 w16se w16cid w16 w16cex w16sdtdh w16sdtfl w16du wp14">
   <w:abstractNum w:abstractNumId="0" w15:restartNumberingAfterBreak="0">
+    <w:nsid w:val="1806584C"/>
+    <w:multiLevelType w:val="hybridMultilevel"/>
+    <w:tmpl w:val="CA0A9714"/>
+    <w:lvl w:ilvl="0" w:tplc="3FA4F25E">
+      <w:start w:val="1"/>
+      <w:numFmt w:val="decimal"/>
+      <w:lvlText w:val="%1."/>
+      <w:lvlJc w:val="left"/>
+      <w:pPr>
+        <w:ind w:left="1080" w:hanging="360"/>
+      </w:pPr>
+      <w:rPr>
+        <w:rFonts w:ascii="Times New Roman" w:hAnsi="Times New Roman" w:cs="Times New Roman" w:hint="default"/>
+      </w:rPr>
+    </w:lvl>
+    <w:lvl w:ilvl="1" w:tplc="04090019" w:tentative="1">
+      <w:start w:val="1"/>
+      <w:numFmt w:val="lowerLetter"/>
+      <w:lvlText w:val="%2."/>
+      <w:lvlJc w:val="left"/>
+      <w:pPr>
+        <w:ind w:left="1800" w:hanging="360"/>
+      </w:pPr>
+    </w:lvl>
+    <w:lvl w:ilvl="2" w:tplc="0409001B" w:tentative="1">
+      <w:start w:val="1"/>
+      <w:numFmt w:val="lowerRoman"/>
+      <w:lvlText w:val="%3."/>
+      <w:lvlJc w:val="right"/>
+      <w:pPr>
+        <w:ind w:left="2520" w:hanging="180"/>
+      </w:pPr>
+    </w:lvl>
+    <w:lvl w:ilvl="3" w:tplc="0409000F" w:tentative="1">
+      <w:start w:val="1"/>
+      <w:numFmt w:val="decimal"/>
+      <w:lvlText w:val="%4."/>
+      <w:lvlJc w:val="left"/>
+      <w:pPr>
+        <w:ind w:left="3240" w:hanging="360"/>
+      </w:pPr>
+    </w:lvl>
+    <w:lvl w:ilvl="4" w:tplc="04090019" w:tentative="1">
+      <w:start w:val="1"/>
+      <w:numFmt w:val="lowerLetter"/>
+      <w:lvlText w:val="%5."/>
+      <w:lvlJc w:val="left"/>
+      <w:pPr>
+        <w:ind w:left="3960" w:hanging="360"/>
+      </w:pPr>
+    </w:lvl>
+    <w:lvl w:ilvl="5" w:tplc="0409001B" w:tentative="1">
+      <w:start w:val="1"/>
+      <w:numFmt w:val="lowerRoman"/>
+      <w:lvlText w:val="%6."/>
+      <w:lvlJc w:val="right"/>
+      <w:pPr>
+        <w:ind w:left="4680" w:hanging="180"/>
+      </w:pPr>
+    </w:lvl>
+    <w:lvl w:ilvl="6" w:tplc="0409000F" w:tentative="1">
+      <w:start w:val="1"/>
+      <w:numFmt w:val="decimal"/>
+      <w:lvlText w:val="%7."/>
+      <w:lvlJc w:val="left"/>
+      <w:pPr>
+        <w:ind w:left="5400" w:hanging="360"/>
+      </w:pPr>
+    </w:lvl>
+    <w:lvl w:ilvl="7" w:tplc="04090019" w:tentative="1">
+      <w:start w:val="1"/>
+      <w:numFmt w:val="lowerLetter"/>
+      <w:lvlText w:val="%8."/>
+      <w:lvlJc w:val="left"/>
+      <w:pPr>
+        <w:ind w:left="6120" w:hanging="360"/>
+      </w:pPr>
+    </w:lvl>
+    <w:lvl w:ilvl="8" w:tplc="0409001B" w:tentative="1">
+      <w:start w:val="1"/>
+      <w:numFmt w:val="lowerRoman"/>
+      <w:lvlText w:val="%9."/>
+      <w:lvlJc w:val="right"/>
+      <w:pPr>
+        <w:ind w:left="6840" w:hanging="180"/>
+      </w:pPr>
+    </w:lvl>
+  </w:abstractNum>
+  <w:abstractNum w:abstractNumId="1" w15:restartNumberingAfterBreak="0">
     <w:nsid w:val="18F478C4"/>
     <w:multiLevelType w:val="hybridMultilevel"/>
     <w:tmpl w:val="A5F067AA"/>
@@ -9040,8 +10292,103 @@
       </w:rPr>
     </w:lvl>
   </w:abstractNum>
+  <w:abstractNum w:abstractNumId="2" w15:restartNumberingAfterBreak="0">
+    <w:nsid w:val="672828A9"/>
+    <w:multiLevelType w:val="hybridMultilevel"/>
+    <w:tmpl w:val="A5761F06"/>
+    <w:lvl w:ilvl="0" w:tplc="0409000F">
+      <w:start w:val="1"/>
+      <w:numFmt w:val="decimal"/>
+      <w:lvlText w:val="%1."/>
+      <w:lvlJc w:val="left"/>
+      <w:pPr>
+        <w:ind w:left="720" w:hanging="360"/>
+      </w:pPr>
+      <w:rPr>
+        <w:rFonts w:hint="default"/>
+      </w:rPr>
+    </w:lvl>
+    <w:lvl w:ilvl="1" w:tplc="04090019">
+      <w:start w:val="1"/>
+      <w:numFmt w:val="lowerLetter"/>
+      <w:lvlText w:val="%2."/>
+      <w:lvlJc w:val="left"/>
+      <w:pPr>
+        <w:ind w:left="1440" w:hanging="360"/>
+      </w:pPr>
+    </w:lvl>
+    <w:lvl w:ilvl="2" w:tplc="0409001B" w:tentative="1">
+      <w:start w:val="1"/>
+      <w:numFmt w:val="lowerRoman"/>
+      <w:lvlText w:val="%3."/>
+      <w:lvlJc w:val="right"/>
+      <w:pPr>
+        <w:ind w:left="2160" w:hanging="180"/>
+      </w:pPr>
+    </w:lvl>
+    <w:lvl w:ilvl="3" w:tplc="0409000F" w:tentative="1">
+      <w:start w:val="1"/>
+      <w:numFmt w:val="decimal"/>
+      <w:lvlText w:val="%4."/>
+      <w:lvlJc w:val="left"/>
+      <w:pPr>
+        <w:ind w:left="2880" w:hanging="360"/>
+      </w:pPr>
+    </w:lvl>
+    <w:lvl w:ilvl="4" w:tplc="04090019" w:tentative="1">
+      <w:start w:val="1"/>
+      <w:numFmt w:val="lowerLetter"/>
+      <w:lvlText w:val="%5."/>
+      <w:lvlJc w:val="left"/>
+      <w:pPr>
+        <w:ind w:left="3600" w:hanging="360"/>
+      </w:pPr>
+    </w:lvl>
+    <w:lvl w:ilvl="5" w:tplc="0409001B" w:tentative="1">
+      <w:start w:val="1"/>
+      <w:numFmt w:val="lowerRoman"/>
+      <w:lvlText w:val="%6."/>
+      <w:lvlJc w:val="right"/>
+      <w:pPr>
+        <w:ind w:left="4320" w:hanging="180"/>
+      </w:pPr>
+    </w:lvl>
+    <w:lvl w:ilvl="6" w:tplc="0409000F" w:tentative="1">
+      <w:start w:val="1"/>
+      <w:numFmt w:val="decimal"/>
+      <w:lvlText w:val="%7."/>
+      <w:lvlJc w:val="left"/>
+      <w:pPr>
+        <w:ind w:left="5040" w:hanging="360"/>
+      </w:pPr>
+    </w:lvl>
+    <w:lvl w:ilvl="7" w:tplc="04090019" w:tentative="1">
+      <w:start w:val="1"/>
+      <w:numFmt w:val="lowerLetter"/>
+      <w:lvlText w:val="%8."/>
+      <w:lvlJc w:val="left"/>
+      <w:pPr>
+        <w:ind w:left="5760" w:hanging="360"/>
+      </w:pPr>
+    </w:lvl>
+    <w:lvl w:ilvl="8" w:tplc="0409001B" w:tentative="1">
+      <w:start w:val="1"/>
+      <w:numFmt w:val="lowerRoman"/>
+      <w:lvlText w:val="%9."/>
+      <w:lvlJc w:val="right"/>
+      <w:pPr>
+        <w:ind w:left="6480" w:hanging="180"/>
+      </w:pPr>
+    </w:lvl>
+  </w:abstractNum>
   <w:num w:numId="1" w16cid:durableId="1739748243">
+    <w:abstractNumId w:val="1"/>
+  </w:num>
+  <w:num w:numId="2" w16cid:durableId="1196770038">
     <w:abstractNumId w:val="0"/>
+  </w:num>
+  <w:num w:numId="3" w16cid:durableId="1553227529">
+    <w:abstractNumId w:val="2"/>
   </w:num>
 </w:numbering>
 </file>

</xml_diff>